<commit_message>
cập nhật giao diện view
</commit_message>
<xml_diff>
--- a/server/templates/report_template.docx
+++ b/server/templates/report_template.docx
@@ -214,9 +214,6 @@
       </w:tblGrid>
       <!-- HEADER ROW -->
       <w:tr>
-        <w:trPr>
-          <w:tblHeader/>
-        </w:trPr>
         <w:tc>
           <w:tcPr>
             <w:tcW w:w="600" w:type="dxa"/>
@@ -319,6 +316,7 @@
         </w:tc>
       </w:tr>
       <!-- SUBHEADER NHÓM I -->
+      {#has_tx1}
       <w:tr>
         <w:tc>
           <w:tcPr>
@@ -446,7 +444,9 @@
           </w:p>
         </w:tc>
       </w:tr>
+      {/has_tx1}
       <!-- SUBHEADER NHÓM II -->
+      {#has_dx1}
       <w:tr>
         <w:tc>
           <w:tcPr>
@@ -548,9 +548,7 @@
           <w:p>
             <w:r>
               <w:rPr>
-                <w:rFonts w:ascii="Times New Roman" w:hAnsi="Times New Roman"/>
-                <w:sz w:val="22"/>
-                <w:color w:val="000000"/>
+                <w:sz w:val="22"/>
               </w:rPr>
               <w:t>{trien_khai}</w:t>
             </w:r>
@@ -575,6 +573,7 @@
           </w:p>
         </w:tc>
       </w:tr>
+      {/has_dx1}
     </w:tbl>
     <!-- CHÚ THÍCH BẢNG I -->
     <w:p>
@@ -657,9 +656,6 @@
       </w:tblGrid>
       <!-- HEADER ROW -->
       <w:tr>
-        <w:trPr>
-          <w:tblHeader/>
-        </w:trPr>
         <w:tc>
           <w:tcPr>
             <w:tcW w:w="600" w:type="dxa"/>
@@ -742,6 +738,7 @@
         </w:tc>
       </w:tr>
       <!-- SUBHEADER NHÓM I -->
+      {#has_tx2}
       <w:tr>
         <w:tc>
           <w:tcPr>
@@ -851,7 +848,9 @@
           </w:p>
         </w:tc>
       </w:tr>
+      {/has_tx2}
       <!-- SUBHEADER NHÓM II -->
+      {#has_dx2}
       <w:tr>
         <w:tc>
           <w:tcPr>
@@ -961,6 +960,7 @@
           </w:p>
         </w:tc>
       </w:tr>
+      {/has_dx2}
     </w:tbl>
     <!-- CHÚ THÍCH BẢNG II -->
     <w:p>
@@ -1142,11 +1142,18 @@
   <w:docDefaults>
     <w:rPrDefault>
       <w:rPr>
-        <w:rFonts w:ascii="Times New Roman" w:hAnsi="Times New Roman" w:cs="Times New Roman"/>
+        <w:rFonts w:ascii="Times New Roman" w:eastAsia="Times New Roman" w:hAnsi="Times New Roman" w:cs="Times New Roman"/>
         <w:sz w:val="26"/>
+        <w:szCs w:val="26"/>
         <w:color w:val="000000"/>
+        <w:lang w:val="vi-VN"/>
       </w:rPr>
     </w:rPrDefault>
+    <w:pPrDefault>
+      <w:pPr>
+        <w:spacing w:line="276" w:lineRule="auto"/>
+      </w:pPr>
+    </w:pPrDefault>
   </w:docDefaults>
 </w:styles>
 </file>
</xml_diff>